<commit_message>
feat: add reminders and storage functionality
- Implemented local notifications for repair reminders in `lib/reminders.ts`, allowing users to receive a notification two days after a diagnosis.
- Created a storage utility in `lib/store.ts` for saving and loading small values on the device, supporting both web and mobile platforms.
- Refactored usage tracking in `lib/usage.ts` to utilize the new storage functions for better data management.
- Updated package dependencies to include `expo-notifications` for handling notifications.
- Enhanced the update documentation to reflect new features and changes in the app's functionality.
</commit_message>
<xml_diff>
--- a/updates/Fixbyte_Update.docx
+++ b/updates/Fixbyte_Update.docx
@@ -429,6 +429,121 @@
         <w:pStyle w:val="Heading2"/>
       </w:pPr>
       <w:r>
+        <w:t xml:space="preserve">Start</w:t>
+      </w:r>
+    </w:p>
+    <w:p>
+      <w:pPr>
+        <w:pStyle w:val="ListParagraph"/>
+        <w:numPr>
+          <w:ilvl w:val="0"/>
+          <w:numId w:val="2"/>
+        </w:numPr>
+        <w:spacing w:after="40"/>
+      </w:pPr>
+      <w:r>
+        <w:t xml:space="preserve">The FixByte logo on white while the app loads, then a fade into the app.</w:t>
+      </w:r>
+    </w:p>
+    <w:p>
+      <w:pPr>
+        <w:pStyle w:val="Heading2"/>
+      </w:pPr>
+      <w:r>
+        <w:t xml:space="preserve">Welcome</w:t>
+      </w:r>
+    </w:p>
+    <w:p>
+      <w:pPr>
+        <w:pStyle w:val="ListParagraph"/>
+        <w:numPr>
+          <w:ilvl w:val="0"/>
+          <w:numId w:val="2"/>
+        </w:numPr>
+        <w:spacing w:after="40"/>
+      </w:pPr>
+      <w:r>
+        <w:t xml:space="preserve">Shown once, until you get past Sign in or Create account.</w:t>
+      </w:r>
+    </w:p>
+    <w:p>
+      <w:pPr>
+        <w:pStyle w:val="ListParagraph"/>
+        <w:numPr>
+          <w:ilvl w:val="0"/>
+          <w:numId w:val="2"/>
+        </w:numPr>
+        <w:spacing w:after="40"/>
+      </w:pPr>
+      <w:r>
+        <w:t xml:space="preserve">"Know what's broken before you pay to fix it."</w:t>
+      </w:r>
+    </w:p>
+    <w:p>
+      <w:pPr>
+        <w:pStyle w:val="ListParagraph"/>
+        <w:numPr>
+          <w:ilvl w:val="0"/>
+          <w:numId w:val="2"/>
+        </w:numPr>
+        <w:spacing w:after="40"/>
+      </w:pPr>
+      <w:r>
+        <w:t xml:space="preserve">Get started opens Create account. I already have an account opens Sign in.</w:t>
+      </w:r>
+    </w:p>
+    <w:p>
+      <w:pPr>
+        <w:pStyle w:val="Heading2"/>
+      </w:pPr>
+      <w:r>
+        <w:t xml:space="preserve">Sign in / Create account</w:t>
+      </w:r>
+    </w:p>
+    <w:p>
+      <w:pPr>
+        <w:pStyle w:val="ListParagraph"/>
+        <w:numPr>
+          <w:ilvl w:val="0"/>
+          <w:numId w:val="2"/>
+        </w:numPr>
+        <w:spacing w:after="40"/>
+      </w:pPr>
+      <w:r>
+        <w:t xml:space="preserve">One page with a sliding switch between Sign in and Create account.</w:t>
+      </w:r>
+    </w:p>
+    <w:p>
+      <w:pPr>
+        <w:pStyle w:val="ListParagraph"/>
+        <w:numPr>
+          <w:ilvl w:val="0"/>
+          <w:numId w:val="2"/>
+        </w:numPr>
+        <w:spacing w:after="40"/>
+      </w:pPr>
+      <w:r>
+        <w:t xml:space="preserve">Email, password (and confirm password when creating an account), Forgot Password, and a Google button.</w:t>
+      </w:r>
+    </w:p>
+    <w:p>
+      <w:pPr>
+        <w:pStyle w:val="ListParagraph"/>
+        <w:numPr>
+          <w:ilvl w:val="0"/>
+          <w:numId w:val="2"/>
+        </w:numPr>
+        <w:spacing w:after="40"/>
+      </w:pPr>
+      <w:r>
+        <w:t xml:space="preserve">Not connected yet: every button goes straight to Home.</w:t>
+      </w:r>
+    </w:p>
+    <w:p>
+      <w:pPr>
+        <w:pStyle w:val="Heading2"/>
+      </w:pPr>
+      <w:r>
         <w:t>Home</w:t>
       </w:r>
     </w:p>
@@ -520,6 +635,19 @@
     </w:p>
     <w:p>
       <w:pPr>
+        <w:pStyle w:val="ListParagraph"/>
+        <w:numPr>
+          <w:ilvl w:val="0"/>
+          <w:numId w:val="2"/>
+        </w:numPr>
+        <w:spacing w:after="40"/>
+      </w:pPr>
+      <w:r>
+        <w:t xml:space="preserve">Phone button (top left) opens My gadgets. The avatar (top right) opens Profile.</w:t>
+      </w:r>
+    </w:p>
+    <w:p>
+      <w:pPr>
         <w:pStyle w:val="Heading2"/>
       </w:pPr>
       <w:r>
@@ -893,6 +1021,207 @@
     </w:p>
     <w:p>
       <w:pPr>
+        <w:pStyle w:val="Heading2"/>
+      </w:pPr>
+      <w:r>
+        <w:t xml:space="preserve">Tab bar</w:t>
+      </w:r>
+    </w:p>
+    <w:p>
+      <w:pPr>
+        <w:pStyle w:val="ListParagraph"/>
+        <w:numPr>
+          <w:ilvl w:val="0"/>
+          <w:numId w:val="2"/>
+        </w:numPr>
+        <w:spacing w:after="40"/>
+      </w:pPr>
+      <w:r>
+        <w:t xml:space="preserve">Shown on My gadgets, History and Profile. Home sits on its own on the left.</w:t>
+      </w:r>
+    </w:p>
+    <w:p>
+      <w:pPr>
+        <w:pStyle w:val="ListParagraph"/>
+        <w:numPr>
+          <w:ilvl w:val="0"/>
+          <w:numId w:val="2"/>
+        </w:numPr>
+        <w:spacing w:after="40"/>
+      </w:pPr>
+      <w:r>
+        <w:t xml:space="preserve">The white pill morphs between tabs: it stretches toward the new tab, then settles.</w:t>
+      </w:r>
+    </w:p>
+    <w:p>
+      <w:pPr>
+        <w:pStyle w:val="Heading2"/>
+      </w:pPr>
+      <w:r>
+        <w:t xml:space="preserve">My gadgets</w:t>
+      </w:r>
+    </w:p>
+    <w:p>
+      <w:pPr>
+        <w:pStyle w:val="ListParagraph"/>
+        <w:numPr>
+          <w:ilvl w:val="0"/>
+          <w:numId w:val="2"/>
+        </w:numPr>
+        <w:spacing w:after="40"/>
+      </w:pPr>
+      <w:r>
+        <w:t xml:space="preserve">Your gadgets with search and All / Phones / Laptops filters.</w:t>
+      </w:r>
+    </w:p>
+    <w:p>
+      <w:pPr>
+        <w:pStyle w:val="ListParagraph"/>
+        <w:numPr>
+          <w:ilvl w:val="0"/>
+          <w:numId w:val="2"/>
+        </w:numPr>
+        <w:spacing w:after="40"/>
+      </w:pPr>
+      <w:r>
+        <w:t xml:space="preserve">Each card shows the last issue, number of checks, last check date and a status.</w:t>
+      </w:r>
+    </w:p>
+    <w:p>
+      <w:pPr>
+        <w:pStyle w:val="ListParagraph"/>
+        <w:numPr>
+          <w:ilvl w:val="0"/>
+          <w:numId w:val="2"/>
+        </w:numPr>
+        <w:spacing w:after="40"/>
+      </w:pPr>
+      <w:r>
+        <w:t xml:space="preserve">Sample data for now. The + and Register a gadget buttons aren't built yet.</w:t>
+      </w:r>
+    </w:p>
+    <w:p>
+      <w:pPr>
+        <w:pStyle w:val="Heading2"/>
+      </w:pPr>
+      <w:r>
+        <w:t xml:space="preserve">History</w:t>
+      </w:r>
+    </w:p>
+    <w:p>
+      <w:pPr>
+        <w:pStyle w:val="ListParagraph"/>
+        <w:numPr>
+          <w:ilvl w:val="0"/>
+          <w:numId w:val="2"/>
+        </w:numPr>
+        <w:spacing w:after="40"/>
+      </w:pPr>
+      <w:r>
+        <w:t xml:space="preserve">Month calendar marking each day: Fixed (green), Checked (black), Needs a pro (hollow).</w:t>
+      </w:r>
+    </w:p>
+    <w:p>
+      <w:pPr>
+        <w:pStyle w:val="ListParagraph"/>
+        <w:numPr>
+          <w:ilvl w:val="0"/>
+          <w:numId w:val="2"/>
+        </w:numPr>
+        <w:spacing w:after="40"/>
+      </w:pPr>
+      <w:r>
+        <w:t xml:space="preserve">Pick a gadget at the top. Tap a day to see only that day's checks.</w:t>
+      </w:r>
+    </w:p>
+    <w:p>
+      <w:pPr>
+        <w:pStyle w:val="ListParagraph"/>
+        <w:numPr>
+          <w:ilvl w:val="0"/>
+          <w:numId w:val="2"/>
+        </w:numPr>
+        <w:spacing w:after="40"/>
+      </w:pPr>
+      <w:r>
+        <w:t xml:space="preserve">Sample data for now.</w:t>
+      </w:r>
+    </w:p>
+    <w:p>
+      <w:pPr>
+        <w:pStyle w:val="Heading2"/>
+      </w:pPr>
+      <w:r>
+        <w:t xml:space="preserve">Profile</w:t>
+      </w:r>
+    </w:p>
+    <w:p>
+      <w:pPr>
+        <w:pStyle w:val="ListParagraph"/>
+        <w:numPr>
+          <w:ilvl w:val="0"/>
+          <w:numId w:val="2"/>
+        </w:numPr>
+        <w:spacing w:after="40"/>
+      </w:pPr>
+      <w:r>
+        <w:t xml:space="preserve">Name and email (editable), and totals: gadgets, checks and fixed yourself.</w:t>
+      </w:r>
+    </w:p>
+    <w:p>
+      <w:pPr>
+        <w:pStyle w:val="ListParagraph"/>
+        <w:numPr>
+          <w:ilvl w:val="0"/>
+          <w:numId w:val="2"/>
+        </w:numPr>
+        <w:spacing w:after="40"/>
+      </w:pPr>
+      <w:r>
+        <w:t xml:space="preserve">Repair reminders, Language (the AI's reply language) and Region (where shop search looks when location is off).</w:t>
+      </w:r>
+    </w:p>
+    <w:p>
+      <w:pPr>
+        <w:pStyle w:val="ListParagraph"/>
+        <w:numPr>
+          <w:ilvl w:val="0"/>
+          <w:numId w:val="2"/>
+        </w:numPr>
+        <w:spacing w:after="40"/>
+      </w:pPr>
+      <w:r>
+        <w:t xml:space="preserve">Password and security: Sign out and Erase data on this device.</w:t>
+      </w:r>
+    </w:p>
+    <w:p>
+      <w:pPr>
+        <w:pStyle w:val="ListParagraph"/>
+        <w:numPr>
+          <w:ilvl w:val="0"/>
+          <w:numId w:val="2"/>
+        </w:numPr>
+        <w:spacing w:after="40"/>
+      </w:pPr>
+      <w:r>
+        <w:t xml:space="preserve">Help &amp; FAQ, Send feedback, Privacy policy, Terms of service and About.</w:t>
+      </w:r>
+    </w:p>
+    <w:p>
+      <w:pPr>
+        <w:pStyle w:val="ListParagraph"/>
+        <w:numPr>
+          <w:ilvl w:val="0"/>
+          <w:numId w:val="2"/>
+        </w:numPr>
+        <w:spacing w:after="40"/>
+      </w:pPr>
+      <w:r>
+        <w:t xml:space="preserve">Sign out returns to the Welcome page.</w:t>
+      </w:r>
+    </w:p>
+    <w:p>
+      <w:pPr>
         <w:pStyle w:val="Heading1"/>
       </w:pPr>
       <w:r>
@@ -917,6 +1246,66 @@
       </w:r>
       <w:r>
         <w:t>: tries Gemini Flash, Gemini Flash-Lite, Groq, Mistral, GitHub Models, then free OpenRouter models. Any without a key is skipped.</w:t>
+      </w:r>
+    </w:p>
+    <w:p>
+      <w:pPr>
+        <w:pStyle w:val="ListParagraph"/>
+        <w:numPr>
+          <w:ilvl w:val="0"/>
+          <w:numId w:val="2"/>
+        </w:numPr>
+        <w:spacing w:after="40"/>
+      </w:pPr>
+      <w:r>
+        <w:rPr>
+          <w:b/>
+          <w:bCs/>
+        </w:rPr>
+        <w:t xml:space="preserve">Language</w:t>
+      </w:r>
+      <w:r>
+        <w:t xml:space="preserve">: the AI writes its replies in the language chosen in Profile.</w:t>
+      </w:r>
+    </w:p>
+    <w:p>
+      <w:pPr>
+        <w:pStyle w:val="ListParagraph"/>
+        <w:numPr>
+          <w:ilvl w:val="0"/>
+          <w:numId w:val="2"/>
+        </w:numPr>
+        <w:spacing w:after="40"/>
+      </w:pPr>
+      <w:r>
+        <w:rPr>
+          <w:b/>
+          <w:bCs/>
+        </w:rPr>
+        <w:t xml:space="preserve">Reminders</w:t>
+      </w:r>
+      <w:r>
+        <w:t xml:space="preserve">: a phone notification two days after a diagnosis (phone app only).</w:t>
+      </w:r>
+    </w:p>
+    <w:p>
+      <w:pPr>
+        <w:pStyle w:val="ListParagraph"/>
+        <w:numPr>
+          <w:ilvl w:val="0"/>
+          <w:numId w:val="2"/>
+        </w:numPr>
+        <w:spacing w:after="40"/>
+      </w:pPr>
+      <w:r>
+        <w:rPr>
+          <w:b/>
+          <w:bCs/>
+        </w:rPr>
+        <w:t xml:space="preserve">Profile</w:t>
+      </w:r>
+      <w:r>
+        <w:t xml:space="preserve">: name, email and settings are saved on the device.</w:t>
       </w:r>
     </w:p>
     <w:p>
@@ -1322,6 +1711,19 @@
     </w:p>
     <w:p>
       <w:pPr>
+        <w:pStyle w:val="ListParagraph"/>
+        <w:numPr>
+          <w:ilvl w:val="0"/>
+          <w:numId w:val="2"/>
+        </w:numPr>
+        <w:spacing w:after="40"/>
+      </w:pPr>
+      <w:r>
+        <w:t xml:space="preserve">Rebuild the APK to get the October 13 pages and repair reminders.</w:t>
+      </w:r>
+    </w:p>
+    <w:p>
+      <w:pPr>
         <w:pStyle w:val="Heading1"/>
       </w:pPr>
       <w:r>
@@ -1738,6 +2140,157 @@
     </w:p>
     <w:p>
       <w:pPr>
+        <w:pStyle w:val="Heading2"/>
+      </w:pPr>
+      <w:r>
+        <w:t xml:space="preserve">October 13, 2026</w:t>
+      </w:r>
+    </w:p>
+    <w:p>
+      <w:pPr>
+        <w:pStyle w:val="ListParagraph"/>
+        <w:numPr>
+          <w:ilvl w:val="0"/>
+          <w:numId w:val="2"/>
+        </w:numPr>
+        <w:spacing w:after="40"/>
+      </w:pPr>
+      <w:r>
+        <w:t xml:space="preserve">Start page: the logo on white, fading into the app.</w:t>
+      </w:r>
+    </w:p>
+    <w:p>
+      <w:pPr>
+        <w:pStyle w:val="ListParagraph"/>
+        <w:numPr>
+          <w:ilvl w:val="0"/>
+          <w:numId w:val="2"/>
+        </w:numPr>
+        <w:spacing w:after="40"/>
+      </w:pPr>
+      <w:r>
+        <w:t xml:space="preserve">Welcome page with Get started and I already have an account.</w:t>
+      </w:r>
+    </w:p>
+    <w:p>
+      <w:pPr>
+        <w:pStyle w:val="ListParagraph"/>
+        <w:numPr>
+          <w:ilvl w:val="0"/>
+          <w:numId w:val="2"/>
+        </w:numPr>
+        <w:spacing w:after="40"/>
+      </w:pPr>
+      <w:r>
+        <w:t xml:space="preserve">Sign in and Create account page with a sliding switch and a Google button (not connected yet: every button goes to Home).</w:t>
+      </w:r>
+    </w:p>
+    <w:p>
+      <w:pPr>
+        <w:pStyle w:val="ListParagraph"/>
+        <w:numPr>
+          <w:ilvl w:val="0"/>
+          <w:numId w:val="2"/>
+        </w:numPr>
+        <w:spacing w:after="40"/>
+      </w:pPr>
+      <w:r>
+        <w:t xml:space="preserve">My gadgets page with search, filters and gadget cards (sample data).</w:t>
+      </w:r>
+    </w:p>
+    <w:p>
+      <w:pPr>
+        <w:pStyle w:val="ListParagraph"/>
+        <w:numPr>
+          <w:ilvl w:val="0"/>
+          <w:numId w:val="2"/>
+        </w:numPr>
+        <w:spacing w:after="40"/>
+      </w:pPr>
+      <w:r>
+        <w:t xml:space="preserve">History page with a month calendar, status markers, gadget picker and a list of checks (sample data).</w:t>
+      </w:r>
+    </w:p>
+    <w:p>
+      <w:pPr>
+        <w:pStyle w:val="ListParagraph"/>
+        <w:numPr>
+          <w:ilvl w:val="0"/>
+          <w:numId w:val="2"/>
+        </w:numPr>
+        <w:spacing w:after="40"/>
+      </w:pPr>
+      <w:r>
+        <w:t xml:space="preserve">Profile page with name, email, stats, settings, support and Sign out.</w:t>
+      </w:r>
+    </w:p>
+    <w:p>
+      <w:pPr>
+        <w:pStyle w:val="ListParagraph"/>
+        <w:numPr>
+          <w:ilvl w:val="0"/>
+          <w:numId w:val="2"/>
+        </w:numPr>
+        <w:spacing w:after="40"/>
+      </w:pPr>
+      <w:r>
+        <w:t xml:space="preserve">All Profile options work: edit name and email, repair reminders, AI reply language, region, help, privacy policy, terms, about, feedback email, sign out and erase data.</w:t>
+      </w:r>
+    </w:p>
+    <w:p>
+      <w:pPr>
+        <w:pStyle w:val="ListParagraph"/>
+        <w:numPr>
+          <w:ilvl w:val="0"/>
+          <w:numId w:val="2"/>
+        </w:numPr>
+        <w:spacing w:after="40"/>
+      </w:pPr>
+      <w:r>
+        <w:t xml:space="preserve">Bottom tab bar for My gadgets, History and Profile, with a pill that morphs between tabs.</w:t>
+      </w:r>
+    </w:p>
+    <w:p>
+      <w:pPr>
+        <w:pStyle w:val="ListParagraph"/>
+        <w:numPr>
+          <w:ilvl w:val="0"/>
+          <w:numId w:val="2"/>
+        </w:numPr>
+        <w:spacing w:after="40"/>
+      </w:pPr>
+      <w:r>
+        <w:t xml:space="preserve">Home's phone button opens My gadgets and the avatar opens Profile. The greeting and avatar use your saved name.</w:t>
+      </w:r>
+    </w:p>
+    <w:p>
+      <w:pPr>
+        <w:pStyle w:val="ListParagraph"/>
+        <w:numPr>
+          <w:ilvl w:val="0"/>
+          <w:numId w:val="2"/>
+        </w:numPr>
+        <w:spacing w:after="40"/>
+      </w:pPr>
+      <w:r>
+        <w:t xml:space="preserve">Shop search uses your Region when location is off.</w:t>
+      </w:r>
+    </w:p>
+    <w:p>
+      <w:pPr>
+        <w:pStyle w:val="ListParagraph"/>
+        <w:numPr>
+          <w:ilvl w:val="0"/>
+          <w:numId w:val="2"/>
+        </w:numPr>
+        <w:spacing w:after="40"/>
+      </w:pPr>
+      <w:r>
+        <w:t xml:space="preserve">Server: chat accepts a reply language; older app versions still work. Redeployed.</w:t>
+      </w:r>
+    </w:p>
+    <w:p>
+      <w:pPr>
         <w:pStyle w:val="Heading1"/>
       </w:pPr>
       <w:r>
@@ -1767,7 +2320,7 @@
         <w:spacing w:after="40"/>
       </w:pPr>
       <w:r>
-        <w:t>Name and avatar are fixed.</w:t>
+        <w:t xml:space="preserve">Sign-in isn't connected to a server: any details get in and there's no real password yet.</w:t>
       </w:r>
     </w:p>
     <w:p>
@@ -1833,6 +2386,45 @@
       </w:pPr>
       <w:r>
         <w:t xml:space="preserve">Gemini's main Flash model can run out of free daily quota. Flash-Lite and the backups take over.</w:t>
+      </w:r>
+    </w:p>
+    <w:p>
+      <w:pPr>
+        <w:pStyle w:val="ListParagraph"/>
+        <w:numPr>
+          <w:ilvl w:val="0"/>
+          <w:numId w:val="2"/>
+        </w:numPr>
+        <w:spacing w:after="40"/>
+      </w:pPr>
+      <w:r>
+        <w:t xml:space="preserve">My gadgets and History show sample data. Registering gadgets isn't built yet.</w:t>
+      </w:r>
+    </w:p>
+    <w:p>
+      <w:pPr>
+        <w:pStyle w:val="ListParagraph"/>
+        <w:numPr>
+          <w:ilvl w:val="0"/>
+          <w:numId w:val="2"/>
+        </w:numPr>
+        <w:spacing w:after="40"/>
+      </w:pPr>
+      <w:r>
+        <w:t xml:space="preserve">Repair reminders work in the phone app only, not the browser.</w:t>
+      </w:r>
+    </w:p>
+    <w:p>
+      <w:pPr>
+        <w:pStyle w:val="ListParagraph"/>
+        <w:numPr>
+          <w:ilvl w:val="0"/>
+          <w:numId w:val="2"/>
+        </w:numPr>
+        <w:spacing w:after="40"/>
+      </w:pPr>
+      <w:r>
+        <w:t xml:space="preserve">Language changes the AI's replies. The app's own buttons and labels stay in English.</w:t>
       </w:r>
     </w:p>
     <w:sectPr>

</xml_diff>

<commit_message>
feat: implement Google sign-in functionality for web and mobile; update dependencies and documentation
</commit_message>
<xml_diff>
--- a/updates/Fixbyte_Update.docx
+++ b/updates/Fixbyte_Update.docx
@@ -23,10 +23,7 @@
         <w:spacing w:after="120"/>
       </w:pPr>
       <w:r>
-        <w:t xml:space="preserve">Version 1.0.1 · </w:t>
-      </w:r>
-      <w:r>
-        <w:t xml:space="preserve">Mobile </w:t>
+        <w:t xml:space="preserve">Version 1.0.1 · Mobile </w:t>
       </w:r>
     </w:p>
     <w:p>
@@ -536,7 +533,33 @@
         <w:spacing w:after="40"/>
       </w:pPr>
       <w:r>
-        <w:t xml:space="preserve">Not connected yet: every button goes straight to Home.</w:t>
+        <w:t xml:space="preserve">An eye button on password fields shows or hides what's typed.</w:t>
+      </w:r>
+    </w:p>
+    <w:p>
+      <w:pPr>
+        <w:pStyle w:val="ListParagraph"/>
+        <w:numPr>
+          <w:ilvl w:val="0"/>
+          <w:numId w:val="2"/>
+        </w:numPr>
+        <w:spacing w:after="40"/>
+      </w:pPr>
+      <w:r>
+        <w:t xml:space="preserve">After Create account: a few optional questions (name, gadgets, repair experience, region, reply language).</w:t>
+      </w:r>
+    </w:p>
+    <w:p>
+      <w:pPr>
+        <w:pStyle w:val="ListParagraph"/>
+        <w:numPr>
+          <w:ilvl w:val="0"/>
+          <w:numId w:val="2"/>
+        </w:numPr>
+        <w:spacing w:after="40"/>
+      </w:pPr>
+      <w:r>
+        <w:t xml:space="preserve">Real accounts (Firebase): Forgot Password emails a reset link. The Google button works in the browser only.</w:t>
       </w:r>
     </w:p>
     <w:p>
@@ -1050,7 +1073,7 @@
         <w:spacing w:after="40"/>
       </w:pPr>
       <w:r>
-        <w:t xml:space="preserve">The white pill morphs between tabs: it stretches toward the new tab, then settles.</w:t>
+        <w:t xml:space="preserve">A floating glass bar. A brighter glass lens morphs between tabs: it stretches toward the new tab, then settles.</w:t>
       </w:r>
     </w:p>
     <w:p>
@@ -1097,7 +1120,7 @@
         <w:spacing w:after="40"/>
       </w:pPr>
       <w:r>
-        <w:t xml:space="preserve">Sample data for now. The + and Register a gadget buttons aren't built yet.</w:t>
+        <w:t xml:space="preserve">Add a gadget with + (a name and a type). Tap a card for Check this gadget or Remove. New accounts start empty.</w:t>
       </w:r>
     </w:p>
     <w:p>
@@ -1118,33 +1141,33 @@
         <w:spacing w:after="40"/>
       </w:pPr>
       <w:r>
-        <w:t xml:space="preserve">Month calendar marking each day: Fixed (green), Checked (black), Needs a pro (hollow).</w:t>
-      </w:r>
-    </w:p>
-    <w:p>
-      <w:pPr>
-        <w:pStyle w:val="ListParagraph"/>
-        <w:numPr>
-          <w:ilvl w:val="0"/>
-          <w:numId w:val="2"/>
-        </w:numPr>
-        <w:spacing w:after="40"/>
-      </w:pPr>
-      <w:r>
-        <w:t xml:space="preserve">Pick a gadget at the top. Tap a day to see only that day's checks.</w:t>
-      </w:r>
-    </w:p>
-    <w:p>
-      <w:pPr>
-        <w:pStyle w:val="ListParagraph"/>
-        <w:numPr>
-          <w:ilvl w:val="0"/>
-          <w:numId w:val="2"/>
-        </w:numPr>
-        <w:spacing w:after="40"/>
-      </w:pPr>
-      <w:r>
-        <w:t xml:space="preserve">Sample data for now.</w:t>
+        <w:t xml:space="preserve">All gadgets by default, or pick one. A month card (totals and calendar) above a timeline of checks, newest first.</w:t>
+      </w:r>
+    </w:p>
+    <w:p>
+      <w:pPr>
+        <w:pStyle w:val="ListParagraph"/>
+        <w:numPr>
+          <w:ilvl w:val="0"/>
+          <w:numId w:val="2"/>
+        </w:numPr>
+        <w:spacing w:after="40"/>
+      </w:pPr>
+      <w:r>
+        <w:t xml:space="preserve">Tap a day to see only that day's checks. Tap a check to Mark as fixed or Remove it.</w:t>
+      </w:r>
+    </w:p>
+    <w:p>
+      <w:pPr>
+        <w:pStyle w:val="ListParagraph"/>
+        <w:numPr>
+          <w:ilvl w:val="0"/>
+          <w:numId w:val="2"/>
+        </w:numPr>
+        <w:spacing w:after="40"/>
+      </w:pPr>
+      <w:r>
+        <w:t xml:space="preserve">Checks are saved automatically when a diagnosis finishes.</w:t>
       </w:r>
     </w:p>
     <w:p>
@@ -1178,7 +1201,7 @@
         <w:spacing w:after="40"/>
       </w:pPr>
       <w:r>
-        <w:t xml:space="preserve">Repair reminders, Language (the AI's reply language) and Region (where shop search looks when location is off).</w:t>
+        <w:t xml:space="preserve">Repair reminders, Appearance (Same as my phone, Light or Dark), Language (the AI's reply language) and Region (where shop search looks when location is off).</w:t>
       </w:r>
     </w:p>
     <w:p>
@@ -1306,6 +1329,86 @@
       </w:r>
       <w:r>
         <w:t xml:space="preserve">: name, email and settings are saved on the device.</w:t>
+      </w:r>
+    </w:p>
+    <w:p>
+      <w:pPr>
+        <w:pStyle w:val="ListParagraph"/>
+        <w:numPr>
+          <w:ilvl w:val="0"/>
+          <w:numId w:val="2"/>
+        </w:numPr>
+        <w:spacing w:after="40"/>
+      </w:pPr>
+      <w:r>
+        <w:rPr>
+          <w:b/>
+          <w:bCs/>
+        </w:rPr>
+        <w:t xml:space="preserve">Accounts</w:t>
+      </w:r>
+      <w:r>
+        <w:t xml:space="preserve">: Firebase email and password. Without the Firebase settings in .env, the app falls back to offline sign-in.</w:t>
+      </w:r>
+    </w:p>
+    <w:p>
+      <w:pPr>
+        <w:pStyle w:val="ListParagraph"/>
+        <w:numPr>
+          <w:ilvl w:val="0"/>
+          <w:numId w:val="2"/>
+        </w:numPr>
+        <w:spacing w:after="40"/>
+      </w:pPr>
+      <w:r>
+        <w:rPr>
+          <w:b/>
+          <w:bCs/>
+        </w:rPr>
+        <w:t xml:space="preserve">Gadgets and History</w:t>
+      </w:r>
+      <w:r>
+        <w:t xml:space="preserve">: saved on the device, per account.</w:t>
+      </w:r>
+    </w:p>
+    <w:p>
+      <w:pPr>
+        <w:pStyle w:val="ListParagraph"/>
+        <w:numPr>
+          <w:ilvl w:val="0"/>
+          <w:numId w:val="2"/>
+        </w:numPr>
+        <w:spacing w:after="40"/>
+      </w:pPr>
+      <w:r>
+        <w:rPr>
+          <w:b/>
+          <w:bCs/>
+        </w:rPr>
+        <w:t xml:space="preserve">Personalised answers</w:t>
+      </w:r>
+      <w:r>
+        <w:t xml:space="preserve">: your repair experience, your gadgets and the gadget being checked are sent with each chat.</w:t>
+      </w:r>
+    </w:p>
+    <w:p>
+      <w:pPr>
+        <w:pStyle w:val="ListParagraph"/>
+        <w:numPr>
+          <w:ilvl w:val="0"/>
+          <w:numId w:val="2"/>
+        </w:numPr>
+        <w:spacing w:after="40"/>
+      </w:pPr>
+      <w:r>
+        <w:rPr>
+          <w:b/>
+          <w:bCs/>
+        </w:rPr>
+        <w:t xml:space="preserve">Glass</w:t>
+      </w:r>
+      <w:r>
+        <w:t xml:space="preserve">: Apple's Liquid Glass on iOS 26, a blur on Android; in Chrome and Edge the page behind also bends at the edges.</w:t>
       </w:r>
     </w:p>
     <w:p>
@@ -1719,7 +1822,7 @@
         <w:spacing w:after="40"/>
       </w:pPr>
       <w:r>
-        <w:t xml:space="preserve">Rebuild the APK to get the October 13 pages and repair reminders.</w:t>
+        <w:t xml:space="preserve">The APK in artifacts/ is from October 8. Rebuild it, with the EXPO_PUBLIC_FIREBASE_* values in .env, to get the October 13-22 updates.</w:t>
       </w:r>
     </w:p>
     <w:p>
@@ -2291,6 +2394,243 @@
     </w:p>
     <w:p>
       <w:pPr>
+        <w:pStyle w:val="Heading2"/>
+      </w:pPr>
+      <w:r>
+        <w:t xml:space="preserve">October 20, 2026</w:t>
+      </w:r>
+    </w:p>
+    <w:p>
+      <w:pPr>
+        <w:pStyle w:val="ListParagraph"/>
+        <w:numPr>
+          <w:ilvl w:val="0"/>
+          <w:numId w:val="2"/>
+        </w:numPr>
+        <w:spacing w:after="40"/>
+      </w:pPr>
+      <w:r>
+        <w:t xml:space="preserve">Real accounts with Firebase: Sign in and Create account use email and password, and errors are shown in plain words.</w:t>
+      </w:r>
+    </w:p>
+    <w:p>
+      <w:pPr>
+        <w:pStyle w:val="ListParagraph"/>
+        <w:numPr>
+          <w:ilvl w:val="0"/>
+          <w:numId w:val="2"/>
+        </w:numPr>
+        <w:spacing w:after="40"/>
+      </w:pPr>
+      <w:r>
+        <w:t xml:space="preserve">Forgot Password emails a reset link. Profile &gt; Password and security can email one too.</w:t>
+      </w:r>
+    </w:p>
+    <w:p>
+      <w:pPr>
+        <w:pStyle w:val="ListParagraph"/>
+        <w:numPr>
+          <w:ilvl w:val="0"/>
+          <w:numId w:val="2"/>
+        </w:numPr>
+        <w:spacing w:after="40"/>
+      </w:pPr>
+      <w:r>
+        <w:t xml:space="preserve">Google sign-in works in the browser. The phone app asks you to use email for now.</w:t>
+      </w:r>
+    </w:p>
+    <w:p>
+      <w:pPr>
+        <w:pStyle w:val="ListParagraph"/>
+        <w:numPr>
+          <w:ilvl w:val="0"/>
+          <w:numId w:val="2"/>
+        </w:numPr>
+        <w:spacing w:after="40"/>
+      </w:pPr>
+      <w:r>
+        <w:t xml:space="preserve">Eye button on password fields to show or hide the password.</w:t>
+      </w:r>
+    </w:p>
+    <w:p>
+      <w:pPr>
+        <w:pStyle w:val="ListParagraph"/>
+        <w:numPr>
+          <w:ilvl w:val="0"/>
+          <w:numId w:val="2"/>
+        </w:numPr>
+        <w:spacing w:after="40"/>
+      </w:pPr>
+      <w:r>
+        <w:t xml:space="preserve">New-account questions after Create account, one per screen: your name, the gadgets you use, how handy you are with repairs, region and reply language. Each one can be skipped.</w:t>
+      </w:r>
+    </w:p>
+    <w:p>
+      <w:pPr>
+        <w:pStyle w:val="ListParagraph"/>
+        <w:numPr>
+          <w:ilvl w:val="0"/>
+          <w:numId w:val="2"/>
+        </w:numPr>
+        <w:spacing w:after="40"/>
+      </w:pPr>
+      <w:r>
+        <w:t xml:space="preserve">The AI uses those answers: repair guides match your experience, and it knows which gadgets you own.</w:t>
+      </w:r>
+    </w:p>
+    <w:p>
+      <w:pPr>
+        <w:pStyle w:val="ListParagraph"/>
+        <w:numPr>
+          <w:ilvl w:val="0"/>
+          <w:numId w:val="2"/>
+        </w:numPr>
+        <w:spacing w:after="40"/>
+      </w:pPr>
+      <w:r>
+        <w:t xml:space="preserve">My gadgets is real: add a gadget (name and type), search, filter by type, and remove a gadget with its checks. New accounts start with none.</w:t>
+      </w:r>
+    </w:p>
+    <w:p>
+      <w:pPr>
+        <w:pStyle w:val="ListParagraph"/>
+        <w:numPr>
+          <w:ilvl w:val="0"/>
+          <w:numId w:val="2"/>
+        </w:numPr>
+        <w:spacing w:after="40"/>
+      </w:pPr>
+      <w:r>
+        <w:t xml:space="preserve">Check this gadget: starts a chat about that one device.</w:t>
+      </w:r>
+    </w:p>
+    <w:p>
+      <w:pPr>
+        <w:pStyle w:val="ListParagraph"/>
+        <w:numPr>
+          <w:ilvl w:val="0"/>
+          <w:numId w:val="2"/>
+        </w:numPr>
+        <w:spacing w:after="40"/>
+      </w:pPr>
+      <w:r>
+        <w:t xml:space="preserve">Every finished diagnosis is saved as a check on the matching gadget. If none matches, the app asks which gadget it is, or adds it as a new one.</w:t>
+      </w:r>
+    </w:p>
+    <w:p>
+      <w:pPr>
+        <w:pStyle w:val="ListParagraph"/>
+        <w:numPr>
+          <w:ilvl w:val="0"/>
+          <w:numId w:val="2"/>
+        </w:numPr>
+        <w:spacing w:after="40"/>
+      </w:pPr>
+      <w:r>
+        <w:t xml:space="preserve">After the repair guide: Did the repair work? Yes marks the check Fixed.</w:t>
+      </w:r>
+    </w:p>
+    <w:p>
+      <w:pPr>
+        <w:pStyle w:val="ListParagraph"/>
+        <w:numPr>
+          <w:ilvl w:val="0"/>
+          <w:numId w:val="2"/>
+        </w:numPr>
+        <w:spacing w:after="40"/>
+      </w:pPr>
+      <w:r>
+        <w:t xml:space="preserve">On phones, the message bar now moves with the keyboard as it slides open, instead of jumping once it's open.</w:t>
+      </w:r>
+    </w:p>
+    <w:p>
+      <w:pPr>
+        <w:pStyle w:val="ListParagraph"/>
+        <w:numPr>
+          <w:ilvl w:val="0"/>
+          <w:numId w:val="2"/>
+        </w:numPr>
+        <w:spacing w:after="40"/>
+      </w:pPr>
+      <w:r>
+        <w:t xml:space="preserve">Glass tab bar: floats over the page with a blur of what's behind, solid icons with labels, and a glass lens that stretches between tabs.</w:t>
+      </w:r>
+    </w:p>
+    <w:p>
+      <w:pPr>
+        <w:pStyle w:val="ListParagraph"/>
+        <w:numPr>
+          <w:ilvl w:val="0"/>
+          <w:numId w:val="2"/>
+        </w:numPr>
+        <w:spacing w:after="40"/>
+      </w:pPr>
+      <w:r>
+        <w:t xml:space="preserve">Server: chat accepts your experience, gadgets and the gadget being checked. Older app versions still work.</w:t>
+      </w:r>
+    </w:p>
+    <w:p>
+      <w:pPr>
+        <w:pStyle w:val="Heading2"/>
+      </w:pPr>
+      <w:r>
+        <w:t xml:space="preserve">October 22, 2026</w:t>
+      </w:r>
+    </w:p>
+    <w:p>
+      <w:pPr>
+        <w:pStyle w:val="ListParagraph"/>
+        <w:numPr>
+          <w:ilvl w:val="0"/>
+          <w:numId w:val="2"/>
+        </w:numPr>
+        <w:spacing w:after="40"/>
+      </w:pPr>
+      <w:r>
+        <w:t xml:space="preserve">History redesigned: all gadgets at once by default, a month card with totals and a calendar, then a timeline of checks grouped by day (Today, Yesterday, then dates). Tap a check to Mark as fixed or Remove it.</w:t>
+      </w:r>
+    </w:p>
+    <w:p>
+      <w:pPr>
+        <w:pStyle w:val="ListParagraph"/>
+        <w:numPr>
+          <w:ilvl w:val="0"/>
+          <w:numId w:val="2"/>
+        </w:numPr>
+        <w:spacing w:after="40"/>
+      </w:pPr>
+      <w:r>
+        <w:t xml:space="preserve">Dark mode: Profile &gt; Appearance offers Same as my phone, Light or Dark. Soft dark greys instead of pure black; the shop map switches to dark tiles.</w:t>
+      </w:r>
+    </w:p>
+    <w:p>
+      <w:pPr>
+        <w:pStyle w:val="ListParagraph"/>
+        <w:numPr>
+          <w:ilvl w:val="0"/>
+          <w:numId w:val="2"/>
+        </w:numPr>
+        <w:spacing w:after="40"/>
+      </w:pPr>
+      <w:r>
+        <w:t xml:space="preserve">Liquid Glass: on iOS 26 the glass uses Apple's own material. In Chrome and Edge, the page behind the glass bends along its edges like a thick lens. Elsewhere it stays a light blur.</w:t>
+      </w:r>
+    </w:p>
+    <w:p>
+      <w:pPr>
+        <w:pStyle w:val="ListParagraph"/>
+        <w:numPr>
+          <w:ilvl w:val="0"/>
+          <w:numId w:val="2"/>
+        </w:numPr>
+        <w:spacing w:after="40"/>
+      </w:pPr>
+      <w:r>
+        <w:t xml:space="preserve">Fixed browsers scrolling the page sideways when the message box was focused.</w:t>
+      </w:r>
+    </w:p>
+    <w:p>
+      <w:pPr>
         <w:pStyle w:val="Heading1"/>
       </w:pPr>
       <w:r>
@@ -2320,7 +2660,7 @@
         <w:spacing w:after="40"/>
       </w:pPr>
       <w:r>
-        <w:t xml:space="preserve">Sign-in isn't connected to a server: any details get in and there's no real password yet.</w:t>
+        <w:t xml:space="preserve">Google sign-in works in the browser only. The phone app uses email and password.</w:t>
       </w:r>
     </w:p>
     <w:p>
@@ -2398,7 +2738,7 @@
         <w:spacing w:after="40"/>
       </w:pPr>
       <w:r>
-        <w:t xml:space="preserve">My gadgets and History show sample data. Registering gadgets isn't built yet.</w:t>
+        <w:t xml:space="preserve">Gadgets and History are saved on the device only: they don't sync between devices and are lost if app data is cleared.</w:t>
       </w:r>
     </w:p>
     <w:p>
@@ -2425,6 +2765,19 @@
       </w:pPr>
       <w:r>
         <w:t xml:space="preserve">Language changes the AI's replies. The app's own buttons and labels stay in English.</w:t>
+      </w:r>
+    </w:p>
+    <w:p>
+      <w:pPr>
+        <w:pStyle w:val="ListParagraph"/>
+        <w:numPr>
+          <w:ilvl w:val="0"/>
+          <w:numId w:val="2"/>
+        </w:numPr>
+        <w:spacing w:after="40"/>
+      </w:pPr>
+      <w:r>
+        <w:t xml:space="preserve">The lens (refraction) effect needs iOS 26 or a Chromium browser (Chrome, Edge). Safari, Firefox and Android show a plain blur.</w:t>
       </w:r>
     </w:p>
     <w:sectPr>

</xml_diff>